<commit_message>
added citation source keyword functionality
`parse.go`: Updated `ProcessFile` to save keywords which occur
            before any quote as a global citation source keyword.

`qris.go`: Updated `WriteQuotes` to process global citation
           source keywords correctly.

Updated `bib22e_FUNKY.docx` and `bib22e_FUNKY_EXPECT.ris` to
test citation source keyword functionality.
</commit_message>
<xml_diff>
--- a/test_files/bib22e_FUNKY.docx
+++ b/test_files/bib22e_FUNKY.docx
@@ -1,6 +1,6 @@
 
 <file path=word/document.xml><?xml version="1.0" encoding="utf-8"?>
-<w:document xmlns:o="urn:schemas-microsoft-com:office:office" xmlns:r="http://schemas.openxmlformats.org/officeDocument/2006/relationships" xmlns:v="urn:schemas-microsoft-com:vml" xmlns:w="http://schemas.openxmlformats.org/wordprocessingml/2006/main" xmlns:w10="urn:schemas-microsoft-com:office:word" xmlns:wp="http://schemas.openxmlformats.org/drawingml/2006/wordprocessingDrawing" xmlns:pic="http://schemas.openxmlformats.org/drawingml/2006/picture" xmlns:wps="http://schemas.microsoft.com/office/word/2010/wordprocessingShape" xmlns:wpg="http://schemas.microsoft.com/office/word/2010/wordprocessingGroup" xmlns:mc="http://schemas.openxmlformats.org/markup-compatibility/2006" xmlns:wp14="http://schemas.microsoft.com/office/word/2010/wordprocessingDrawing" xmlns:w14="http://schemas.microsoft.com/office/word/2010/wordml" xmlns:w15="http://schemas.microsoft.com/office/word/2012/wordml" mc:Ignorable="w14 wp14 w15">
+<w:document xmlns:o="urn:schemas-microsoft-com:office:office" xmlns:r="http://schemas.openxmlformats.org/officeDocument/2006/relationships" xmlns:v="urn:schemas-microsoft-com:vml" xmlns:w="http://schemas.openxmlformats.org/wordprocessingml/2006/main" xmlns:w10="urn:schemas-microsoft-com:office:word" xmlns:wp="http://schemas.openxmlformats.org/drawingml/2006/wordprocessingDrawing" xmlns:wps="http://schemas.microsoft.com/office/word/2010/wordprocessingShape" xmlns:wpg="http://schemas.microsoft.com/office/word/2010/wordprocessingGroup" xmlns:mc="http://schemas.openxmlformats.org/markup-compatibility/2006" xmlns:wp14="http://schemas.microsoft.com/office/word/2010/wordprocessingDrawing" xmlns:w14="http://schemas.microsoft.com/office/word/2010/wordml" xmlns:w15="http://schemas.microsoft.com/office/word/2012/wordml" mc:Ignorable="w14 wp14 w15">
   <w:body>
     <w:p>
       <w:pPr>
@@ -77,6 +77,16 @@
       </w:pPr>
       <w:r>
         <w:rPr/>
+        <w:t>^S: Thinking</w:t>
+      </w:r>
+    </w:p>
+    <w:p>
+      <w:pPr>
+        <w:pStyle w:val="Textzbib"/>
+        <w:rPr/>
+      </w:pPr>
+      <w:r>
+        <w:rPr/>
         <w:t xml:space="preserve">  </w:t>
       </w:r>
       <w:r>
@@ -698,6 +708,16 @@
       </w:pPr>
       <w:r>
         <w:rPr/>
+        <w:t>^s: Magic Squares ; Theosophic</w:t>
+      </w:r>
+    </w:p>
+    <w:p>
+      <w:pPr>
+        <w:pStyle w:val="Textzbib"/>
+        <w:rPr/>
+      </w:pPr>
+      <w:r>
+        <w:rPr/>
         <w:t xml:space="preserve">If it be true that the soul of the world is about to animate the materialism of modern life it will create for itself a new language of power and beauty, and architecture will again become a living art, for architecture deals in visible symbols, and visible symbols form the very language of mysticism. </w:t>
         <w:tab/>
         <w:t xml:space="preserve">p. 1 </w:t>
@@ -1332,7 +1352,7 @@
       <w:pPr>
         <w:pStyle w:val="Textzbib"/>
         <w:spacing w:lineRule="auto" w:line="252" w:before="0" w:after="58"/>
-        <w:ind w:hanging="288" w:left="288"/>
+        <w:ind w:left="288" w:hanging="288"/>
         <w:rPr/>
       </w:pPr>
       <w:r>
@@ -1358,7 +1378,7 @@
 </file>
 
 <file path=word/footer1.xml><?xml version="1.0" encoding="utf-8"?>
-<w:ftr xmlns:o="urn:schemas-microsoft-com:office:office" xmlns:r="http://schemas.openxmlformats.org/officeDocument/2006/relationships" xmlns:v="urn:schemas-microsoft-com:vml" xmlns:w="http://schemas.openxmlformats.org/wordprocessingml/2006/main" xmlns:w10="urn:schemas-microsoft-com:office:word" xmlns:wp="http://schemas.openxmlformats.org/drawingml/2006/wordprocessingDrawing" xmlns:pic="http://schemas.openxmlformats.org/drawingml/2006/picture" xmlns:wps="http://schemas.microsoft.com/office/word/2010/wordprocessingShape" xmlns:wpg="http://schemas.microsoft.com/office/word/2010/wordprocessingGroup" xmlns:mc="http://schemas.openxmlformats.org/markup-compatibility/2006" xmlns:wp14="http://schemas.microsoft.com/office/word/2010/wordprocessingDrawing" xmlns:w14="http://schemas.microsoft.com/office/word/2010/wordml" xmlns:w15="http://schemas.microsoft.com/office/word/2012/wordml" mc:Ignorable="w14 wp14 w15">
+<w:ftr xmlns:o="urn:schemas-microsoft-com:office:office" xmlns:r="http://schemas.openxmlformats.org/officeDocument/2006/relationships" xmlns:v="urn:schemas-microsoft-com:vml" xmlns:w="http://schemas.openxmlformats.org/wordprocessingml/2006/main" xmlns:w10="urn:schemas-microsoft-com:office:word" xmlns:wp="http://schemas.openxmlformats.org/drawingml/2006/wordprocessingDrawing" xmlns:wps="http://schemas.microsoft.com/office/word/2010/wordprocessingShape" xmlns:wpg="http://schemas.microsoft.com/office/word/2010/wordprocessingGroup" xmlns:mc="http://schemas.openxmlformats.org/markup-compatibility/2006" xmlns:wp14="http://schemas.microsoft.com/office/word/2010/wordprocessingDrawing" xmlns:w14="http://schemas.microsoft.com/office/word/2010/wordml" xmlns:w15="http://schemas.microsoft.com/office/word/2012/wordml" mc:Ignorable="w14 wp14 w15">
   <w:p>
     <w:pPr>
       <w:pStyle w:val="Footer"/>
@@ -1373,7 +1393,7 @@
 </file>
 
 <file path=word/footer2.xml><?xml version="1.0" encoding="utf-8"?>
-<w:ftr xmlns:o="urn:schemas-microsoft-com:office:office" xmlns:r="http://schemas.openxmlformats.org/officeDocument/2006/relationships" xmlns:v="urn:schemas-microsoft-com:vml" xmlns:w="http://schemas.openxmlformats.org/wordprocessingml/2006/main" xmlns:w10="urn:schemas-microsoft-com:office:word" xmlns:wp="http://schemas.openxmlformats.org/drawingml/2006/wordprocessingDrawing" xmlns:pic="http://schemas.openxmlformats.org/drawingml/2006/picture" xmlns:wps="http://schemas.microsoft.com/office/word/2010/wordprocessingShape" xmlns:wpg="http://schemas.microsoft.com/office/word/2010/wordprocessingGroup" xmlns:mc="http://schemas.openxmlformats.org/markup-compatibility/2006" xmlns:wp14="http://schemas.microsoft.com/office/word/2010/wordprocessingDrawing" xmlns:w14="http://schemas.microsoft.com/office/word/2010/wordml" xmlns:w15="http://schemas.microsoft.com/office/word/2012/wordml" mc:Ignorable="w14 wp14 w15">
+<w:ftr xmlns:o="urn:schemas-microsoft-com:office:office" xmlns:r="http://schemas.openxmlformats.org/officeDocument/2006/relationships" xmlns:v="urn:schemas-microsoft-com:vml" xmlns:w="http://schemas.openxmlformats.org/wordprocessingml/2006/main" xmlns:w10="urn:schemas-microsoft-com:office:word" xmlns:wp="http://schemas.openxmlformats.org/drawingml/2006/wordprocessingDrawing" xmlns:wps="http://schemas.microsoft.com/office/word/2010/wordprocessingShape" xmlns:wpg="http://schemas.microsoft.com/office/word/2010/wordprocessingGroup" xmlns:mc="http://schemas.openxmlformats.org/markup-compatibility/2006" xmlns:wp14="http://schemas.microsoft.com/office/word/2010/wordprocessingDrawing" xmlns:w14="http://schemas.microsoft.com/office/word/2010/wordml" xmlns:w15="http://schemas.microsoft.com/office/word/2012/wordml" mc:Ignorable="w14 wp14 w15">
   <w:p>
     <w:pPr>
       <w:pStyle w:val="Footer"/>
@@ -1465,7 +1485,7 @@
 </file>
 
 <file path=word/footer3.xml><?xml version="1.0" encoding="utf-8"?>
-<w:ftr xmlns:o="urn:schemas-microsoft-com:office:office" xmlns:r="http://schemas.openxmlformats.org/officeDocument/2006/relationships" xmlns:v="urn:schemas-microsoft-com:vml" xmlns:w="http://schemas.openxmlformats.org/wordprocessingml/2006/main" xmlns:w10="urn:schemas-microsoft-com:office:word" xmlns:wp="http://schemas.openxmlformats.org/drawingml/2006/wordprocessingDrawing" xmlns:pic="http://schemas.openxmlformats.org/drawingml/2006/picture" xmlns:wps="http://schemas.microsoft.com/office/word/2010/wordprocessingShape" xmlns:wpg="http://schemas.microsoft.com/office/word/2010/wordprocessingGroup" xmlns:mc="http://schemas.openxmlformats.org/markup-compatibility/2006" xmlns:wp14="http://schemas.microsoft.com/office/word/2010/wordprocessingDrawing" xmlns:w14="http://schemas.microsoft.com/office/word/2010/wordml" xmlns:w15="http://schemas.microsoft.com/office/word/2012/wordml" mc:Ignorable="w14 wp14 w15">
+<w:ftr xmlns:o="urn:schemas-microsoft-com:office:office" xmlns:r="http://schemas.openxmlformats.org/officeDocument/2006/relationships" xmlns:v="urn:schemas-microsoft-com:vml" xmlns:w="http://schemas.openxmlformats.org/wordprocessingml/2006/main" xmlns:w10="urn:schemas-microsoft-com:office:word" xmlns:wp="http://schemas.openxmlformats.org/drawingml/2006/wordprocessingDrawing" xmlns:wps="http://schemas.microsoft.com/office/word/2010/wordprocessingShape" xmlns:wpg="http://schemas.microsoft.com/office/word/2010/wordprocessingGroup" xmlns:mc="http://schemas.openxmlformats.org/markup-compatibility/2006" xmlns:wp14="http://schemas.microsoft.com/office/word/2010/wordprocessingDrawing" xmlns:w14="http://schemas.microsoft.com/office/word/2010/wordml" xmlns:w15="http://schemas.microsoft.com/office/word/2012/wordml" mc:Ignorable="w14 wp14 w15">
   <w:p>
     <w:pPr>
       <w:pStyle w:val="Footer"/>
@@ -1981,9 +2001,9 @@
     </w:rPr>
   </w:style>
   <w:style w:type="paragraph" w:styleId="Heading1">
-    <w:name w:val="heading 1"/>
+    <w:name w:val="Heading 1"/>
     <w:basedOn w:val="Heading"/>
-    <w:next w:val="BodyText"/>
+    <w:next w:val="TextBody"/>
     <w:autoRedefine/>
     <w:qFormat/>
     <w:rsid w:val="009914fd"/>
@@ -1997,9 +2017,9 @@
     </w:rPr>
   </w:style>
   <w:style w:type="paragraph" w:styleId="Heading2">
-    <w:name w:val="heading 2"/>
+    <w:name w:val="Heading 2"/>
     <w:basedOn w:val="Heading"/>
-    <w:next w:val="BodyText"/>
+    <w:next w:val="TextBody"/>
     <w:autoRedefine/>
     <w:qFormat/>
     <w:rsid w:val="009914fd"/>
@@ -2016,7 +2036,7 @@
     </w:rPr>
   </w:style>
   <w:style w:type="paragraph" w:styleId="Heading3">
-    <w:name w:val="heading 3"/>
+    <w:name w:val="Heading 3"/>
     <w:basedOn w:val="Heading"/>
     <w:next w:val="Normal"/>
     <w:autoRedefine/>
@@ -2034,7 +2054,7 @@
     </w:rPr>
   </w:style>
   <w:style w:type="paragraph" w:styleId="Heading4">
-    <w:name w:val="heading 4"/>
+    <w:name w:val="Heading 4"/>
     <w:basedOn w:val="Heading"/>
     <w:next w:val="Normal"/>
     <w:autoRedefine/>
@@ -2050,7 +2070,7 @@
     </w:rPr>
   </w:style>
   <w:style w:type="paragraph" w:styleId="Heading5">
-    <w:name w:val="heading 5"/>
+    <w:name w:val="Heading 5"/>
     <w:basedOn w:val="Heading"/>
     <w:next w:val="Normal"/>
     <w:autoRedefine/>
@@ -2066,7 +2086,7 @@
     </w:rPr>
   </w:style>
   <w:style w:type="paragraph" w:styleId="Heading6">
-    <w:name w:val="heading 6"/>
+    <w:name w:val="Heading 6"/>
     <w:basedOn w:val="Heading"/>
     <w:next w:val="Normal"/>
     <w:autoRedefine/>
@@ -2083,7 +2103,7 @@
     </w:rPr>
   </w:style>
   <w:style w:type="paragraph" w:styleId="Heading7">
-    <w:name w:val="heading 7"/>
+    <w:name w:val="Heading 7"/>
     <w:basedOn w:val="Heading"/>
     <w:next w:val="Normal"/>
     <w:autoRedefine/>
@@ -2107,7 +2127,7 @@
     </w:rPr>
   </w:style>
   <w:style w:type="paragraph" w:styleId="Heading8">
-    <w:name w:val="heading 8"/>
+    <w:name w:val="Heading 8"/>
     <w:basedOn w:val="Heading"/>
     <w:next w:val="Normal"/>
     <w:autoRedefine/>
@@ -2125,9 +2145,9 @@
     </w:rPr>
   </w:style>
   <w:style w:type="paragraph" w:styleId="Heading9">
-    <w:name w:val="heading 9"/>
+    <w:name w:val="Heading 9"/>
     <w:basedOn w:val="Normal"/>
-    <w:next w:val="BodyText"/>
+    <w:next w:val="TextBody"/>
     <w:autoRedefine/>
     <w:qFormat/>
     <w:rsid w:val="001871c5"/>
@@ -2166,22 +2186,15 @@
     <w:qFormat/>
     <w:rPr/>
   </w:style>
-  <w:style w:type="character" w:styleId="FootnoteCharacters" w:customStyle="1">
+  <w:style w:type="character" w:styleId="FootnoteCharacters">
     <w:name w:val="Footnote Characters"/>
     <w:qFormat/>
     <w:rPr>
       <w:vertAlign w:val="superscript"/>
     </w:rPr>
   </w:style>
-  <w:style w:type="character" w:styleId="FootnoteCharactersuser">
-    <w:name w:val="Footnote Characters (user)"/>
-    <w:qFormat/>
-    <w:rPr>
-      <w:vertAlign w:val="superscript"/>
-    </w:rPr>
-  </w:style>
-  <w:style w:type="character" w:styleId="FootnoteReference">
-    <w:name w:val="footnote reference"/>
+  <w:style w:type="character" w:styleId="FootnoteAnchor">
+    <w:name w:val="Footnote Reference"/>
     <w:rPr>
       <w:vertAlign w:val="superscript"/>
     </w:rPr>
@@ -2264,7 +2277,7 @@
       <w:lang w:eastAsia="zh-CN" w:bidi="hi-IN"/>
     </w:rPr>
   </w:style>
-  <w:style w:type="character" w:styleId="Hyperlink">
+  <w:style w:type="character" w:styleId="InternetLink1">
     <w:name w:val="Hyperlink"/>
     <w:basedOn w:val="DefaultParagraphFont"/>
     <w:uiPriority w:val="99"/>
@@ -2274,13 +2287,13 @@
       <w:color w:val="0038A8"/>
       <w:sz w:val="23"/>
       <w:szCs w:val="23"/>
-      <w:u w:val="single" w:color="D9D9D9" w:themeColor="light1" w:themeShade="d9"/>
+      <w:u w:val="single" w:color="D9D9D9"/>
       <w:lang w:eastAsia="en-US" w:bidi="ar-SA"/>
     </w:rPr>
   </w:style>
   <w:style w:type="paragraph" w:styleId="Heading" w:customStyle="1">
     <w:name w:val="Heading"/>
-    <w:next w:val="BodyText"/>
+    <w:next w:val="TextBody"/>
     <w:autoRedefine/>
     <w:qFormat/>
     <w:rsid w:val="009914fd"/>
@@ -2312,7 +2325,7 @@
       <w14:numForm w14:val="oldStyle"/>
     </w:rPr>
   </w:style>
-  <w:style w:type="paragraph" w:styleId="BodyText">
+  <w:style w:type="paragraph" w:styleId="TextBody">
     <w:name w:val="Body Text"/>
     <w:basedOn w:val="Normal"/>
     <w:link w:val="BodyTextChar"/>
@@ -2357,31 +2370,47 @@
     </w:rPr>
   </w:style>
   <w:style w:type="paragraph" w:styleId="Caption">
+    <w:name w:val="Caption"/>
+    <w:basedOn w:val="Normal"/>
+    <w:qFormat/>
+    <w:pPr>
+      <w:suppressLineNumbers/>
+      <w:spacing w:before="120" w:after="120"/>
+    </w:pPr>
+    <w:rPr>
+      <w:rFonts w:cs="FreeSans"/>
+      <w:i/>
+      <w:iCs/>
+      <w:sz w:val="24"/>
+      <w:szCs w:val="24"/>
+    </w:rPr>
+  </w:style>
+  <w:style w:type="paragraph" w:styleId="Index">
+    <w:name w:val="Index"/>
+    <w:basedOn w:val="Normal"/>
+    <w:qFormat/>
+    <w:pPr>
+      <w:suppressLineNumbers/>
+    </w:pPr>
+    <w:rPr>
+      <w:rFonts w:cs="Arial"/>
+    </w:rPr>
+  </w:style>
+  <w:style w:type="paragraph" w:styleId="Caption1">
     <w:name w:val="caption"/>
     <w:basedOn w:val="Normal"/>
-    <w:next w:val="BodyText"/>
+    <w:next w:val="TextBody"/>
     <w:autoRedefine/>
     <w:qFormat/>
     <w:rsid w:val="00ad360c"/>
     <w:pPr>
       <w:spacing w:lineRule="auto" w:line="252" w:before="60" w:after="60"/>
-      <w:ind w:left="720"/>
+      <w:ind w:left="720" w:hanging="0"/>
     </w:pPr>
     <w:rPr>
       <w:rFonts w:eastAsia="Times New Roman" w:cs="Times New Roman"/>
       <w:sz w:val="22"/>
       <w:szCs w:val="21"/>
-    </w:rPr>
-  </w:style>
-  <w:style w:type="paragraph" w:styleId="Index">
-    <w:name w:val="Index"/>
-    <w:basedOn w:val="Normal"/>
-    <w:qFormat/>
-    <w:pPr>
-      <w:suppressLineNumbers/>
-    </w:pPr>
-    <w:rPr>
-      <w:rFonts w:cs="Arial"/>
     </w:rPr>
   </w:style>
   <w:style w:type="paragraph" w:styleId="Standard" w:customStyle="1">
@@ -2425,13 +2454,13 @@
     </w:rPr>
   </w:style>
   <w:style w:type="paragraph" w:styleId="Footnote" w:customStyle="1">
-    <w:name w:val="Footnote"/>
+    <w:name w:val="Footnote Text"/>
     <w:basedOn w:val="Standard"/>
     <w:qFormat/>
     <w:rsid w:val="004260a7"/>
     <w:pPr>
       <w:suppressLineNumbers/>
-      <w:ind w:hanging="288" w:left="288" w:right="288"/>
+      <w:ind w:left="288" w:right="288" w:hanging="288"/>
     </w:pPr>
     <w:rPr>
       <w:sz w:val="20"/>
@@ -2455,7 +2484,7 @@
         <w:tab w:val="decimal" w:pos="7920" w:leader="none"/>
       </w:tabs>
       <w:spacing w:lineRule="auto" w:line="252" w:before="86" w:after="29"/>
-      <w:ind w:hanging="2551" w:left="2835"/>
+      <w:ind w:left="2835" w:hanging="2551"/>
     </w:pPr>
     <w:rPr>
       <w:sz w:val="30"/>
@@ -2486,13 +2515,13 @@
   <w:style w:type="paragraph" w:styleId="BodyTextItalic" w:customStyle="1">
     <w:name w:val="Body Text Italic"/>
     <w:basedOn w:val="Normal"/>
-    <w:next w:val="BodyText"/>
+    <w:next w:val="TextBody"/>
     <w:autoRedefine/>
     <w:qFormat/>
     <w:rsid w:val="00d9167a"/>
     <w:pPr>
       <w:spacing w:lineRule="auto" w:line="252" w:before="120" w:after="120"/>
-      <w:ind w:left="360" w:right="576"/>
+      <w:ind w:left="360" w:right="576" w:hanging="0"/>
     </w:pPr>
     <w:rPr>
       <w:i/>
@@ -2500,7 +2529,7 @@
       <w14:ligatures w14:val="standard"/>
     </w:rPr>
   </w:style>
-  <w:style w:type="paragraph" w:styleId="xFilename" w:customStyle="1">
+  <w:style w:type="paragraph" w:styleId="XFilename" w:customStyle="1">
     <w:name w:val="x File name"/>
     <w:basedOn w:val="Standard"/>
     <w:next w:val="Normal"/>
@@ -2534,7 +2563,7 @@
         <w:tab w:val="decimal" w:pos="7920" w:leader="none"/>
       </w:tabs>
       <w:spacing w:lineRule="auto" w:line="252" w:before="0" w:after="58"/>
-      <w:ind w:hanging="288" w:left="288"/>
+      <w:ind w:left="288" w:hanging="288"/>
     </w:pPr>
     <w:rPr>
       <w:sz w:val="22"/>
@@ -2545,10 +2574,10 @@
       </w14:cntxtAlts>
     </w:rPr>
   </w:style>
-  <w:style w:type="paragraph" w:styleId="BodyTextIndent">
+  <w:style w:type="paragraph" w:styleId="TextBodyIndent">
     <w:name w:val="Body Text Indent"/>
-    <w:basedOn w:val="BodyText"/>
-    <w:next w:val="BodyText"/>
+    <w:basedOn w:val="TextBody"/>
+    <w:next w:val="TextBody"/>
     <w:link w:val="BodyTextIndentChar"/>
     <w:autoRedefine/>
     <w:uiPriority w:val="99"/>
@@ -2556,7 +2585,7 @@
     <w:rsid w:val="00ad360c"/>
     <w:pPr>
       <w:spacing w:before="120" w:after="120"/>
-      <w:ind w:left="360"/>
+      <w:ind w:left="360" w:hanging="0"/>
     </w:pPr>
     <w:rPr>
       <w:rFonts w:eastAsia="Times New Roman" w:cs="Times New Roman"/>
@@ -2571,7 +2600,7 @@
     <w:rPr/>
   </w:style>
   <w:style w:type="paragraph" w:styleId="Footer">
-    <w:name w:val="footer"/>
+    <w:name w:val="Footer"/>
     <w:basedOn w:val="Normal"/>
     <w:link w:val="FooterChar"/>
     <w:uiPriority w:val="99"/>
@@ -2601,7 +2630,7 @@
     </w:rPr>
   </w:style>
   <w:style w:type="paragraph" w:styleId="Header">
-    <w:name w:val="header"/>
+    <w:name w:val="Header"/>
     <w:basedOn w:val="Normal"/>
     <w:link w:val="HeaderChar"/>
     <w:uiPriority w:val="99"/>
@@ -2635,14 +2664,14 @@
     </w:pPr>
     <w:rPr/>
   </w:style>
-  <w:style w:type="paragraph" w:styleId="Textbodyindent" w:customStyle="1">
+  <w:style w:type="paragraph" w:styleId="Textbodyindent1" w:customStyle="1">
     <w:name w:val="Text body indent"/>
     <w:basedOn w:val="Normal"/>
     <w:qFormat/>
     <w:rsid w:val="00143408"/>
     <w:pPr>
       <w:suppressAutoHyphens w:val="false"/>
-      <w:ind w:left="360"/>
+      <w:ind w:left="360" w:hanging="0"/>
       <w:textAlignment w:val="auto"/>
     </w:pPr>
     <w:rPr/>
@@ -2654,7 +2683,7 @@
     <w:rsid w:val="001537be"/>
     <w:pPr>
       <w:suppressAutoHyphens w:val="false"/>
-      <w:ind w:hanging="144" w:left="864"/>
+      <w:ind w:left="864" w:hanging="144"/>
       <w:textAlignment w:val="auto"/>
       <w:outlineLvl w:val="1"/>
     </w:pPr>
@@ -2662,25 +2691,25 @@
   </w:style>
   <w:style w:type="paragraph" w:styleId="Textbody1ind" w:customStyle="1">
     <w:name w:val="Text body 1ind"/>
-    <w:basedOn w:val="Textbody"/>
+    <w:basedOn w:val="Textbody1"/>
     <w:autoRedefine/>
     <w:qFormat/>
     <w:rsid w:val="002c3226"/>
     <w:pPr>
-      <w:ind w:left="504"/>
+      <w:ind w:left="504" w:hanging="0"/>
       <w:textAlignment w:val="auto"/>
       <w:outlineLvl w:val="0"/>
     </w:pPr>
     <w:rPr/>
   </w:style>
-  <w:style w:type="paragraph" w:styleId="Textbody" w:customStyle="1">
+  <w:style w:type="paragraph" w:styleId="Textbody1" w:customStyle="1">
     <w:name w:val="Text body"/>
     <w:basedOn w:val="Normal"/>
     <w:qFormat/>
     <w:rsid w:val="002c3226"/>
     <w:pPr>
       <w:spacing w:before="80" w:after="80"/>
-      <w:ind w:hanging="144" w:left="144"/>
+      <w:ind w:left="144" w:hanging="144"/>
     </w:pPr>
     <w:rPr>
       <w:sz w:val="22"/>
@@ -2688,11 +2717,11 @@
   </w:style>
   <w:style w:type="paragraph" w:styleId="Textbody3ind" w:customStyle="1">
     <w:name w:val="Text body 3ind"/>
-    <w:basedOn w:val="Textbody"/>
+    <w:basedOn w:val="Textbody1"/>
     <w:qFormat/>
     <w:rsid w:val="002c3226"/>
     <w:pPr>
-      <w:ind w:left="1224"/>
+      <w:ind w:left="1224" w:hanging="144"/>
       <w:outlineLvl w:val="2"/>
     </w:pPr>
     <w:rPr/>

</xml_diff>